<commit_message>
Docs: aprobacion DoD de Luis, nombre FitSearch en README e instrucciones Miro actualizadas
</commit_message>
<xml_diff>
--- a/FASE 2/Evidencias Grupales/2.4_GuiaEstudiante_Fase 2_DesarrolloProyecto APT (Español).docx
+++ b/FASE 2/Evidencias Grupales/2.4_GuiaEstudiante_Fase 2_DesarrolloProyecto APT (Español).docx
@@ -737,7 +737,7 @@
                 <w:color w:val="000000"/>
                 <w:sz w:val="20"/>
               </w:rPr>
-              <w:t>se elaboró la DoD del proyecto con 15 criterios por historia de usuario (funcionalidad, código, pruebas, seguridad, despliegue, datos y documentación) y 5 criterios de cierre de sprint.</w:t>
+              <w:t>se elaboró la DoD del proyecto con 15 criterios por historia de usuario (funcionalidad, código, pruebas, seguridad, despliegue, datos y documentación) y 5 criterios de cierre de sprint. Está aprobada por el Product Owner y el Scrum Master; la aprobación del Scrum Master se registró con el primer pull request del equipo, revisado y fusionado en GitHub como exige la propia DoD.</w:t>
             </w:r>
           </w:p>
           <w:p>
@@ -2459,7 +2459,7 @@
                 <w:color w:val="000000"/>
                 <w:sz w:val="16"/>
               </w:rPr>
-              <w:t>Actividad agregada: entregable ágil obligatorio de la Fase 2. Documento creado; pendiente aprobación del equipo.</w:t>
+              <w:t>Actividad agregada: entregable ágil obligatorio de la Fase 2. DoD v1.5 aprobada por Rodrigo Cárcamo Rojas (20-09-2026) y Luis Méndez (22-09-2026, mediante pull request revisado en GitHub); falta la aprobación de Nicolás Silva.</w:t>
             </w:r>
           </w:p>
         </w:tc>

</xml_diff>

<commit_message>
Registra la aprobacion de la DoD de Nicolas Silva (PR #5) en la Guia 2.4 y el control
</commit_message>
<xml_diff>
--- a/FASE 2/Evidencias Grupales/2.4_GuiaEstudiante_Fase 2_DesarrolloProyecto APT (Español).docx
+++ b/FASE 2/Evidencias Grupales/2.4_GuiaEstudiante_Fase 2_DesarrolloProyecto APT (Español).docx
@@ -737,7 +737,7 @@
                 <w:color w:val="000000"/>
                 <w:sz w:val="20"/>
               </w:rPr>
-              <w:t>se elaboró la DoD del proyecto con 15 criterios por historia de usuario (funcionalidad, código, pruebas, seguridad, despliegue, datos y documentación) y 5 criterios de cierre de sprint. Está aprobada por el Product Owner y el Scrum Master; la aprobación del Scrum Master se registró con el primer pull request del equipo, revisado y fusionado en GitHub como exige la propia DoD.</w:t>
+              <w:t>se elaboró la DoD del proyecto con 15 criterios por historia de usuario (funcionalidad, código, pruebas, seguridad, despliegue, datos y documentación) y 5 criterios de cierre de sprint. Está aprobada por los tres integrantes; las aprobaciones de Luis Méndez (Scrum Master) y Nicolás Silva se registraron mediante pull request en GitHub (#1 y #5), revisados y fusionados como exige la propia DoD.</w:t>
             </w:r>
           </w:p>
           <w:p>
@@ -2462,7 +2462,7 @@
                 <w:color w:val="000000"/>
                 <w:sz w:val="16"/>
               </w:rPr>
-              <w:t>En curso</w:t>
+              <w:t>Completado</w:t>
             </w:r>
           </w:p>
         </w:tc>
@@ -2481,7 +2481,7 @@
                 <w:color w:val="000000"/>
                 <w:sz w:val="16"/>
               </w:rPr>
-              <w:t>Actividad agregada: entregable ágil obligatorio de la Fase 2. DoD v1.6 (23-09-2026: solo se actualizó el alcance a FS-HU-20). La v1.5 fue aprobada por Rodrigo Cárcamo Rojas (20-09-2026) y Luis Méndez (22-09-2026, mediante pull request revisado en GitHub); falta la aprobación de Nicolás Silva.</w:t>
+              <w:t>Actividad agregada: entregable ágil obligatorio de la Fase 2. DoD v1.6 (23-09-2026: solo se actualizó el alcance a FS-HU-20). Aprobada por los tres integrantes: Rodrigo Cárcamo Rojas (20-09-2026), Luis Méndez (22-09-2026, pull request #1) y Nicolás Silva (22-09-2026, pull request #5).</w:t>
             </w:r>
           </w:p>
         </w:tc>

</xml_diff>